<commit_message>
Update live Vercel deployment URL to https://uni-log.vercel.app/login
</commit_message>
<xml_diff>
--- a/PROJECT_REPORT_UNILOG_Deepthi_N_Raikar.docx
+++ b/PROJECT_REPORT_UNILOG_Deepthi_N_Raikar.docx
@@ -293,6 +293,51 @@
                 <w:color w:val="334155"/>
                 <w:sz w:val="20"/>
               </w:rPr>
+              <w:t>Live Application URL</w:t>
+            </w:r>
+          </w:p>
+        </w:tc>
+        <w:tc>
+          <w:tcPr>
+            <w:tcW w:type="dxa" w:w="5760"/>
+            <w:tcMar>
+              <w:top w:w="80" w:type="dxa"/>
+              <w:bottom w:w="80" w:type="dxa"/>
+              <w:left w:w="100" w:type="dxa"/>
+              <w:right w:w="100" w:type="dxa"/>
+            </w:tcMar>
+            <w:shd w:fill="FFFFFF"/>
+          </w:tcPr>
+          <w:p>
+            <w:r>
+              <w:rPr>
+                <w:color w:val="0F172A"/>
+                <w:sz w:val="21"/>
+              </w:rPr>
+              <w:t>https://uni-log.vercel.app/login</w:t>
+            </w:r>
+          </w:p>
+        </w:tc>
+      </w:tr>
+      <w:tr>
+        <w:tc>
+          <w:tcPr>
+            <w:tcW w:type="dxa" w:w="3600"/>
+            <w:tcMar>
+              <w:top w:w="80" w:type="dxa"/>
+              <w:bottom w:w="80" w:type="dxa"/>
+              <w:left w:w="100" w:type="dxa"/>
+              <w:right w:w="100" w:type="dxa"/>
+            </w:tcMar>
+            <w:shd w:fill="F1F5F9"/>
+          </w:tcPr>
+          <w:p>
+            <w:r>
+              <w:rPr>
+                <w:b/>
+                <w:color w:val="334155"/>
+                <w:sz w:val="20"/>
+              </w:rPr>
               <w:t>GitHub Repository</w:t>
             </w:r>
           </w:p>
@@ -314,7 +359,7 @@
                 <w:color w:val="0F172A"/>
                 <w:sz w:val="21"/>
               </w:rPr>
-              <w:t>https://github.com/deepthiraikar/unilog</w:t>
+              <w:t>https://github.com/deepthiraikar/UniLog</w:t>
             </w:r>
           </w:p>
         </w:tc>

</xml_diff>